<commit_message>
found an error so committing to new branch instead of main
</commit_message>
<xml_diff>
--- a/docassemble/MotionToStayEviction/data/templates/Motion_To_Stay_Eviction.docx
+++ b/docassemble/MotionToStayEviction/data/templates/Motion_To_Stay_Eviction.docx
@@ -63,32 +63,39 @@
         <w:jc w:val="center"/>
       </w:pPr>
       <w:r>
+        <w:t xml:space="preserve">{% if not </w:t>
+      </w:r>
+      <w:proofErr w:type="spellStart"/>
+      <w:r>
+        <w:t>is_first_document</w:t>
+      </w:r>
+      <w:proofErr w:type="spellEnd"/>
+      <w:r>
+        <w:t xml:space="preserve"> %} </w:t>
+      </w:r>
+      <w:r>
         <w:t>APPEALS COURT DOCKET NO.</w:t>
       </w:r>
       <w:r>
         <w:t xml:space="preserve"> </w:t>
       </w:r>
-      <w:r>
-        <w:t xml:space="preserve">{% if not </w:t>
-      </w:r>
-      <w:proofErr w:type="spellStart"/>
-      <w:r>
-        <w:t>is_first_document</w:t>
-      </w:r>
-      <w:proofErr w:type="spellEnd"/>
-      <w:r>
-        <w:t xml:space="preserve"> %} {{ </w:t>
-      </w:r>
-      <w:proofErr w:type="spellStart"/>
-      <w:r>
-        <w:t>appeals_court_docket_number</w:t>
+      <w:proofErr w:type="gramStart"/>
+      <w:r>
+        <w:t xml:space="preserve">{{ </w:t>
+      </w:r>
+      <w:proofErr w:type="spellStart"/>
+      <w:r>
+        <w:t>appeals</w:t>
+      </w:r>
+      <w:proofErr w:type="gramEnd"/>
+      <w:r>
+        <w:t>_court_docket_number</w:t>
       </w:r>
       <w:proofErr w:type="spellEnd"/>
       <w:r>
         <w:t xml:space="preserve"> }} {% endif %}</w:t>
       </w:r>
     </w:p>
-    <w:p/>
     <w:p/>
     <w:p/>
     <w:p>
@@ -848,6 +855,7 @@
         </w:numPr>
       </w:pPr>
       <w:r>
+        <w:lastRenderedPageBreak/>
         <w:t xml:space="preserve">I am asking for an order from a single justice that: </w:t>
       </w:r>
     </w:p>
@@ -1058,6 +1066,7 @@
           <w:bCs/>
         </w:rPr>
       </w:pPr>
+      <w:proofErr w:type="gramStart"/>
       <w:r>
         <w:rPr>
           <w:bCs/>
@@ -1072,6 +1081,7 @@
         <w:t>showifdef</w:t>
       </w:r>
       <w:proofErr w:type="spellEnd"/>
+      <w:proofErr w:type="gramEnd"/>
       <w:r>
         <w:rPr>
           <w:bCs/>
@@ -1091,6 +1101,19 @@
         <w:t>}}</w:t>
       </w:r>
     </w:p>
+    <w:p>
+      <w:pPr>
+        <w:rPr>
+          <w:bCs/>
+        </w:rPr>
+      </w:pPr>
+      <w:r>
+        <w:rPr>
+          <w:bCs/>
+        </w:rPr>
+        <w:br w:type="page"/>
+      </w:r>
+    </w:p>
     <w:p/>
     <w:p>
       <w:pPr>
@@ -1125,7 +1148,13 @@
         <w:t xml:space="preserve">and supporting materials </w:t>
       </w:r>
       <w:r>
-        <w:t>upon the attorney of record for each attorney of record, or if the party has no attorney then I made service directly on the self-represented party by</w:t>
+        <w:t xml:space="preserve">upon the attorney of record for each </w:t>
+      </w:r>
+      <w:r>
+        <w:t>party</w:t>
+      </w:r>
+      <w:r>
+        <w:t>, or if the party has no attorney then I made service directly on the self-represented party by</w:t>
       </w:r>
       <w:r>
         <w:t xml:space="preserve"> {{ </w:t>
@@ -1338,25 +1367,33 @@
         <w:jc w:val="center"/>
       </w:pPr>
       <w:r>
+        <w:t xml:space="preserve">{% if not </w:t>
+      </w:r>
+      <w:proofErr w:type="spellStart"/>
+      <w:r>
+        <w:t>is_first_document</w:t>
+      </w:r>
+      <w:proofErr w:type="spellEnd"/>
+      <w:r>
+        <w:t xml:space="preserve"> %} </w:t>
+      </w:r>
+      <w:r>
         <w:t>APPEALS COURT DOCKET NO.</w:t>
       </w:r>
       <w:r>
-        <w:t xml:space="preserve"> {% if not </w:t>
-      </w:r>
-      <w:proofErr w:type="spellStart"/>
-      <w:r>
-        <w:t>is_first_document</w:t>
-      </w:r>
-      <w:proofErr w:type="spellEnd"/>
-      <w:r>
-        <w:t xml:space="preserve"> %}</w:t>
-      </w:r>
-      <w:r>
-        <w:t xml:space="preserve"> {{ </w:t>
-      </w:r>
-      <w:proofErr w:type="spellStart"/>
-      <w:r>
-        <w:t>appeals_court_docket_number</w:t>
+        <w:t xml:space="preserve"> </w:t>
+      </w:r>
+      <w:proofErr w:type="gramStart"/>
+      <w:r>
+        <w:t xml:space="preserve">{{ </w:t>
+      </w:r>
+      <w:proofErr w:type="spellStart"/>
+      <w:r>
+        <w:t>appeals</w:t>
+      </w:r>
+      <w:proofErr w:type="gramEnd"/>
+      <w:r>
+        <w:t>_court_docket_number</w:t>
       </w:r>
       <w:proofErr w:type="spellEnd"/>
       <w:r>
@@ -1368,10 +1405,8 @@
     </w:p>
     <w:p/>
     <w:p/>
-    <w:p/>
-    <w:p>
-      <w:pPr>
-        <w:jc w:val="center"/>
+    <w:p>
+      <w:pPr>
         <w:rPr>
           <w:b/>
         </w:rPr>
@@ -1480,15 +1515,11 @@
       <w:pPr>
         <w:jc w:val="center"/>
         <w:rPr>
-          <w:b/>
-          <w:bCs/>
           <w:u w:val="double"/>
         </w:rPr>
       </w:pPr>
       <w:r>
         <w:rPr>
-          <w:b/>
-          <w:bCs/>
           <w:u w:val="double"/>
         </w:rPr>
         <w:t>MEMORANDUM IN SUPPORT OF MOTION TO STAY PURSUANT TO MASS. R. A. P. 6(A)</w:t>
@@ -1958,133 +1989,154 @@
     <w:p/>
     <w:p>
       <w:r>
+        <w:t xml:space="preserve">{%p if </w:t>
+      </w:r>
+      <w:proofErr w:type="spellStart"/>
+      <w:r>
+        <w:t>i</w:t>
+      </w:r>
+      <w:proofErr w:type="spellEnd"/>
+      <w:r>
+        <w:t xml:space="preserve"> == "final" %}</w:t>
+      </w:r>
+    </w:p>
+    <w:p>
+      <w:r>
+        <w:lastRenderedPageBreak/>
+        <w:t>{{ user</w:t>
+      </w:r>
+      <w:r>
+        <w:t>s</w:t>
+      </w:r>
+      <w:r>
+        <w:rPr>
+          <w:bCs/>
+        </w:rPr>
+        <w:t>[0].</w:t>
+      </w:r>
+      <w:r>
+        <w:t>signature }}</w:t>
+      </w:r>
+    </w:p>
+    <w:p>
+      <w:r>
+        <w:t>{%p endif %}</w:t>
+      </w:r>
+    </w:p>
+    <w:p>
+      <w:r>
+        <w:rPr>
+          <w:bCs/>
+        </w:rPr>
+        <w:t xml:space="preserve">{{ </w:t>
+      </w:r>
+      <w:proofErr w:type="spellStart"/>
+      <w:r>
+        <w:rPr>
+          <w:bCs/>
+        </w:rPr>
+        <w:t>format_date</w:t>
+      </w:r>
+      <w:proofErr w:type="spellEnd"/>
+      <w:r>
+        <w:rPr>
+          <w:bCs/>
+        </w:rPr>
+        <w:t>(today()) }}</w:t>
+      </w:r>
+      <w:r>
+        <w:br w:type="page"/>
+      </w:r>
+    </w:p>
+    <w:p>
+      <w:r>
         <w:lastRenderedPageBreak/>
         <w:t xml:space="preserve">{%p if </w:t>
       </w:r>
       <w:proofErr w:type="spellStart"/>
       <w:r>
-        <w:t>i</w:t>
-      </w:r>
-      <w:proofErr w:type="spellEnd"/>
-      <w:r>
-        <w:t xml:space="preserve"> == "final" %}</w:t>
-      </w:r>
-    </w:p>
-    <w:p>
-      <w:r>
-        <w:t>{{ user</w:t>
-      </w:r>
-      <w:r>
-        <w:t>s</w:t>
-      </w:r>
-      <w:r>
-        <w:rPr>
-          <w:bCs/>
-        </w:rPr>
-        <w:t>[0].</w:t>
-      </w:r>
-      <w:r>
-        <w:t>signature }}</w:t>
-      </w:r>
-    </w:p>
-    <w:p>
-      <w:r>
-        <w:t>{%p endif %}</w:t>
-      </w:r>
-    </w:p>
-    <w:p>
-      <w:r>
-        <w:rPr>
-          <w:bCs/>
-        </w:rPr>
+        <w:t>has_evidence</w:t>
+      </w:r>
+      <w:proofErr w:type="spellEnd"/>
+      <w:r>
+        <w:t xml:space="preserve"> %}</w:t>
+      </w:r>
+    </w:p>
+    <w:p>
+      <w:pPr>
+        <w:jc w:val="center"/>
+      </w:pPr>
+      <w:r>
+        <w:t>COMMONWEALTH OF MASSACHUSETTS</w:t>
+      </w:r>
+    </w:p>
+    <w:p>
+      <w:pPr>
+        <w:jc w:val="center"/>
+      </w:pPr>
+      <w:r>
+        <w:t>APPEALS COURT</w:t>
+      </w:r>
+    </w:p>
+    <w:p/>
+    <w:p>
+      <w:pPr>
+        <w:jc w:val="center"/>
+      </w:pPr>
+      <w:r>
         <w:t xml:space="preserve">{{ </w:t>
       </w:r>
       <w:proofErr w:type="spellStart"/>
       <w:r>
-        <w:rPr>
-          <w:bCs/>
-        </w:rPr>
-        <w:t>format_date</w:t>
-      </w:r>
-      <w:proofErr w:type="spellEnd"/>
-      <w:r>
-        <w:rPr>
-          <w:bCs/>
-        </w:rPr>
-        <w:t>(today()) }}</w:t>
-      </w:r>
-      <w:r>
-        <w:br w:type="page"/>
-      </w:r>
-    </w:p>
-    <w:p>
-      <w:pPr>
-        <w:jc w:val="center"/>
-      </w:pPr>
-      <w:r>
-        <w:lastRenderedPageBreak/>
-        <w:t>COMMONWEALTH OF MASSACHUSETTS</w:t>
-      </w:r>
-    </w:p>
-    <w:p>
-      <w:pPr>
-        <w:jc w:val="center"/>
-      </w:pPr>
-      <w:r>
-        <w:t>APPEALS COURT</w:t>
-      </w:r>
-    </w:p>
-    <w:p/>
-    <w:p>
-      <w:pPr>
-        <w:jc w:val="center"/>
-      </w:pPr>
+        <w:t>housing_court</w:t>
+      </w:r>
+      <w:proofErr w:type="spellEnd"/>
+      <w:r>
+        <w:t xml:space="preserve"> }} HOUSING COURT DOCKET NO. {{ </w:t>
+      </w:r>
+      <w:proofErr w:type="spellStart"/>
+      <w:r>
+        <w:t>housing_court_docket_number</w:t>
+      </w:r>
+      <w:proofErr w:type="spellEnd"/>
+      <w:r>
+        <w:t xml:space="preserve"> }}</w:t>
+      </w:r>
+    </w:p>
+    <w:p>
+      <w:pPr>
+        <w:ind w:left="3600"/>
+      </w:pPr>
+    </w:p>
+    <w:p>
+      <w:pPr>
+        <w:jc w:val="center"/>
+      </w:pPr>
+      <w:r>
+        <w:t xml:space="preserve">{% if not </w:t>
+      </w:r>
+      <w:proofErr w:type="spellStart"/>
+      <w:r>
+        <w:t>is_first_document</w:t>
+      </w:r>
+      <w:proofErr w:type="spellEnd"/>
+      <w:r>
+        <w:t xml:space="preserve"> %} </w:t>
+      </w:r>
+      <w:r>
+        <w:t xml:space="preserve">APPEALS COURT DOCKET NO. </w:t>
+      </w:r>
+      <w:proofErr w:type="gramStart"/>
       <w:r>
         <w:t xml:space="preserve">{{ </w:t>
       </w:r>
       <w:proofErr w:type="spellStart"/>
       <w:r>
-        <w:t>housing_court</w:t>
-      </w:r>
-      <w:proofErr w:type="spellEnd"/>
-      <w:r>
-        <w:t xml:space="preserve"> }} HOUSING COURT DOCKET NO. {{ </w:t>
-      </w:r>
-      <w:proofErr w:type="spellStart"/>
-      <w:r>
-        <w:t>housing_court_docket_number</w:t>
-      </w:r>
-      <w:proofErr w:type="spellEnd"/>
-      <w:r>
-        <w:t xml:space="preserve"> }}</w:t>
-      </w:r>
-    </w:p>
-    <w:p>
-      <w:pPr>
-        <w:ind w:left="3600"/>
-      </w:pPr>
-    </w:p>
-    <w:p>
-      <w:pPr>
-        <w:jc w:val="center"/>
-      </w:pPr>
-      <w:r>
-        <w:t xml:space="preserve">APPEALS COURT DOCKET NO. </w:t>
-      </w:r>
-      <w:r>
-        <w:t xml:space="preserve">{% if not </w:t>
-      </w:r>
-      <w:proofErr w:type="spellStart"/>
-      <w:r>
-        <w:t>is_first_document</w:t>
-      </w:r>
-      <w:proofErr w:type="spellEnd"/>
-      <w:r>
-        <w:t xml:space="preserve"> %} {{ </w:t>
-      </w:r>
-      <w:proofErr w:type="spellStart"/>
-      <w:r>
-        <w:t>appeals_court_docket_number</w:t>
+        <w:t>appeals</w:t>
+      </w:r>
+      <w:proofErr w:type="gramEnd"/>
+      <w:r>
+        <w:t>_court_docket_number</w:t>
       </w:r>
       <w:proofErr w:type="spellEnd"/>
       <w:r>
@@ -2232,33 +2284,15 @@
           <w:numId w:val="4"/>
         </w:numPr>
         <w:spacing w:line="480" w:lineRule="auto"/>
-        <w:rPr>
-          <w:sz w:val="20"/>
-          <w:szCs w:val="20"/>
-        </w:rPr>
-      </w:pPr>
-      <w:r>
-        <w:rPr>
-          <w:sz w:val="20"/>
-          <w:szCs w:val="20"/>
-        </w:rPr>
-        <w:t xml:space="preserve">{%p if </w:t>
-      </w:r>
-      <w:proofErr w:type="spellStart"/>
-      <w:r>
-        <w:rPr>
-          <w:sz w:val="20"/>
-          <w:szCs w:val="20"/>
-        </w:rPr>
-        <w:t>has_evidence</w:t>
-      </w:r>
-      <w:proofErr w:type="spellEnd"/>
-      <w:r>
-        <w:rPr>
-          <w:sz w:val="20"/>
-          <w:szCs w:val="20"/>
-        </w:rPr>
-        <w:t xml:space="preserve"> %}</w:t>
+      </w:pPr>
+      <w:r>
+        <w:t>{%</w:t>
+      </w:r>
+      <w:r>
+        <w:t>p</w:t>
+      </w:r>
+      <w:r>
+        <w:t xml:space="preserve"> for exhibit in exhibits %}</w:t>
       </w:r>
     </w:p>
     <w:p>
@@ -2269,31 +2303,22 @@
           <w:numId w:val="4"/>
         </w:numPr>
         <w:spacing w:line="480" w:lineRule="auto"/>
-        <w:rPr>
-          <w:sz w:val="20"/>
-          <w:szCs w:val="20"/>
-        </w:rPr>
-      </w:pPr>
-      <w:r>
-        <w:rPr>
-          <w:sz w:val="20"/>
-          <w:szCs w:val="20"/>
-        </w:rPr>
-        <w:t>{%</w:t>
-      </w:r>
-      <w:r>
-        <w:rPr>
-          <w:sz w:val="20"/>
-          <w:szCs w:val="20"/>
-        </w:rPr>
-        <w:t>p</w:t>
-      </w:r>
-      <w:r>
-        <w:rPr>
-          <w:sz w:val="20"/>
-          <w:szCs w:val="20"/>
-        </w:rPr>
-        <w:t xml:space="preserve"> for exhibit in exhibits %}</w:t>
+      </w:pPr>
+      <w:proofErr w:type="gramStart"/>
+      <w:r>
+        <w:t xml:space="preserve">{{ </w:t>
+      </w:r>
+      <w:proofErr w:type="spellStart"/>
+      <w:r>
+        <w:t>exhibit</w:t>
+      </w:r>
+      <w:proofErr w:type="gramEnd"/>
+      <w:r>
+        <w:t>.filename</w:t>
+      </w:r>
+      <w:proofErr w:type="spellEnd"/>
+      <w:r>
+        <w:t xml:space="preserve"> }}</w:t>
       </w:r>
     </w:p>
     <w:p>
@@ -2304,110 +2329,42 @@
           <w:numId w:val="4"/>
         </w:numPr>
         <w:spacing w:line="480" w:lineRule="auto"/>
-        <w:rPr>
-          <w:sz w:val="20"/>
-          <w:szCs w:val="20"/>
-        </w:rPr>
-      </w:pPr>
-      <w:r>
-        <w:rPr>
-          <w:sz w:val="20"/>
-          <w:szCs w:val="20"/>
-        </w:rPr>
-        <w:t xml:space="preserve">{{ </w:t>
-      </w:r>
-      <w:proofErr w:type="spellStart"/>
-      <w:r>
-        <w:rPr>
-          <w:sz w:val="20"/>
-          <w:szCs w:val="20"/>
-        </w:rPr>
-        <w:t>exhibit.filename</w:t>
-      </w:r>
-      <w:proofErr w:type="spellEnd"/>
-      <w:r>
-        <w:rPr>
-          <w:sz w:val="20"/>
-          <w:szCs w:val="20"/>
-        </w:rPr>
-        <w:t xml:space="preserve"> }}</w:t>
-      </w:r>
-    </w:p>
-    <w:p>
-      <w:pPr>
-        <w:pStyle w:val="ListParagraph"/>
-        <w:numPr>
-          <w:ilvl w:val="0"/>
-          <w:numId w:val="4"/>
-        </w:numPr>
+      </w:pPr>
+      <w:r>
+        <w:rPr>
+          <w:bCs/>
+          <w:iCs/>
+          <w:lang w:val="en-GB"/>
+        </w:rPr>
+        <w:t xml:space="preserve">{%p </w:t>
+      </w:r>
+      <w:proofErr w:type="spellStart"/>
+      <w:r>
+        <w:rPr>
+          <w:bCs/>
+          <w:iCs/>
+          <w:lang w:val="en-GB"/>
+        </w:rPr>
+        <w:t>endfor</w:t>
+      </w:r>
+      <w:proofErr w:type="spellEnd"/>
+      <w:r>
+        <w:rPr>
+          <w:bCs/>
+          <w:iCs/>
+          <w:lang w:val="en-GB"/>
+        </w:rPr>
+        <w:t xml:space="preserve"> %}</w:t>
+      </w:r>
+    </w:p>
+    <w:p>
+      <w:pPr>
         <w:spacing w:line="480" w:lineRule="auto"/>
-        <w:rPr>
-          <w:sz w:val="20"/>
-          <w:szCs w:val="20"/>
-        </w:rPr>
       </w:pPr>
       <w:r>
         <w:rPr>
           <w:bCs/>
           <w:iCs/>
-          <w:sz w:val="20"/>
-          <w:szCs w:val="20"/>
-          <w:lang w:val="en-GB"/>
-        </w:rPr>
-        <w:t xml:space="preserve">{%p </w:t>
-      </w:r>
-      <w:proofErr w:type="spellStart"/>
-      <w:r>
-        <w:rPr>
-          <w:bCs/>
-          <w:iCs/>
-          <w:sz w:val="20"/>
-          <w:szCs w:val="20"/>
-          <w:lang w:val="en-GB"/>
-        </w:rPr>
-        <w:t>end</w:t>
-      </w:r>
-      <w:r>
-        <w:rPr>
-          <w:bCs/>
-          <w:iCs/>
-          <w:sz w:val="20"/>
-          <w:szCs w:val="20"/>
-          <w:lang w:val="en-GB"/>
-        </w:rPr>
-        <w:t>for</w:t>
-      </w:r>
-      <w:proofErr w:type="spellEnd"/>
-      <w:r>
-        <w:rPr>
-          <w:bCs/>
-          <w:iCs/>
-          <w:sz w:val="20"/>
-          <w:szCs w:val="20"/>
-          <w:lang w:val="en-GB"/>
-        </w:rPr>
-        <w:t xml:space="preserve"> %}</w:t>
-      </w:r>
-    </w:p>
-    <w:p>
-      <w:pPr>
-        <w:pStyle w:val="ListParagraph"/>
-        <w:numPr>
-          <w:ilvl w:val="0"/>
-          <w:numId w:val="4"/>
-        </w:numPr>
-        <w:spacing w:line="480" w:lineRule="auto"/>
-        <w:rPr>
-          <w:sz w:val="20"/>
-          <w:szCs w:val="20"/>
-        </w:rPr>
-      </w:pPr>
-      <w:r>
-        <w:rPr>
-          <w:bCs/>
-          <w:iCs/>
-          <w:sz w:val="20"/>
-          <w:szCs w:val="20"/>
           <w:lang w:val="en-GB"/>
         </w:rPr>
         <w:t>{%p endif %}</w:t>
@@ -3563,7 +3520,6 @@
   <w:style w:type="character" w:default="1" w:styleId="DefaultParagraphFont">
     <w:name w:val="Default Paragraph Font"/>
     <w:uiPriority w:val="1"/>
-    <w:semiHidden/>
     <w:unhideWhenUsed/>
   </w:style>
   <w:style w:type="table" w:default="1" w:styleId="TableNormal">

</xml_diff>